<commit_message>
Add complete formatted submission docx document
</commit_message>
<xml_diff>
--- a/Darukaa_Earth_Submission.docx
+++ b/Darukaa_Earth_Submission.docx
@@ -4,6 +4,7 @@
   <w:body>
     <w:p>
       <w:pPr>
+        <w:spacing w:after="80"/>
         <w:jc w:val="center"/>
       </w:pPr>
       <w:r>
@@ -31,10 +32,10 @@
             <w:tcW w:type="dxa" w:w="9936"/>
             <w:shd w:fill="F0F4F8"/>
             <w:tcMar>
-              <w:top w:w="140" w:type="dxa"/>
-              <w:bottom w:w="140" w:type="dxa"/>
-              <w:left w:w="200" w:type="dxa"/>
-              <w:right w:w="200" w:type="dxa"/>
+              <w:top w:w="160" w:type="dxa"/>
+              <w:bottom w:w="160" w:type="dxa"/>
+              <w:left w:w="220" w:type="dxa"/>
+              <w:right w:w="220" w:type="dxa"/>
             </w:tcMar>
           </w:tcPr>
           <w:p>
@@ -53,12 +54,14 @@
             <w:r>
               <w:rPr>
                 <w:b/>
+                <w:sz w:val="21"/>
               </w:rPr>
               <w:t xml:space="preserve">GitHub Repository: </w:t>
             </w:r>
             <w:r>
               <w:rPr>
                 <w:color w:val="0056B3"/>
+                <w:sz w:val="21"/>
               </w:rPr>
               <w:t>https://github.com/aayushpatilcodes-dot/darukaa-earth.git</w:t>
               <w:br/>
@@ -66,12 +69,44 @@
             <w:r>
               <w:rPr>
                 <w:b/>
+                <w:sz w:val="21"/>
               </w:rPr>
-              <w:t xml:space="preserve">Challenge: </w:t>
+              <w:t xml:space="preserve">Live Frontend URL: </w:t>
+            </w:r>
+            <w:r>
+              <w:rPr>
+                <w:color w:val="0056B3"/>
+                <w:sz w:val="21"/>
+              </w:rPr>
+              <w:t>https://darukaa-earth.vercel.app</w:t>
+              <w:br/>
+            </w:r>
+            <w:r>
+              <w:rPr>
+                <w:b/>
+                <w:sz w:val="21"/>
+              </w:rPr>
+              <w:t xml:space="preserve">Live Backend API: </w:t>
+            </w:r>
+            <w:r>
+              <w:rPr>
+                <w:color w:val="0056B3"/>
+                <w:sz w:val="21"/>
+              </w:rPr>
+              <w:t>https://darukaa-backend.onrender.com</w:t>
+              <w:br/>
+            </w:r>
+            <w:r>
+              <w:rPr>
+                <w:b/>
+                <w:sz w:val="21"/>
+              </w:rPr>
+              <w:t xml:space="preserve">Challenge Specification: </w:t>
             </w:r>
             <w:r>
               <w:rPr>
                 <w:i/>
+                <w:sz w:val="21"/>
               </w:rPr>
               <w:t>Darukaa.Earth Full-Stack Developer Hackathon Challenge</w:t>
             </w:r>
@@ -79,7 +114,11 @@
         </w:tc>
       </w:tr>
     </w:tbl>
-    <w:p/>
+    <w:p>
+      <w:pPr>
+        <w:spacing w:after="160"/>
+      </w:pPr>
+    </w:p>
     <w:p>
       <w:pPr>
         <w:spacing w:before="320" w:after="120"/>
@@ -95,17 +134,11 @@
       </w:r>
     </w:p>
     <w:p>
-      <w:pPr>
-        <w:spacing w:after="160"/>
-      </w:pPr>
       <w:r>
         <w:t>Darukaa.Earth is a full-stack, enterprise-grade geospatial analytics dashboard engineered to manage, visualize, and monitor carbon credit and biodiversity restoration projects across the globe. Administrators can create environmental projects, capture precise geographic site boundaries using interactive polygon drawing tools, and analyze multi-year environmental time-series metrics (NDVI, Carbon Stock, Biodiversity Index, and Canopy Cover).</w:t>
       </w:r>
     </w:p>
     <w:p>
-      <w:pPr>
-        <w:spacing w:after="240"/>
-      </w:pPr>
       <w:r>
         <w:t>This document serves as the official Submission Deliverable adhering to all requirements set forth in the Darukaa.Earth Full-Stack Developer Hackathon specification.</w:t>
       </w:r>
@@ -539,7 +572,7 @@
     </w:tbl>
     <w:p>
       <w:pPr>
-        <w:spacing w:after="200"/>
+        <w:spacing w:after="160"/>
       </w:pPr>
     </w:p>
     <w:p>
@@ -627,7 +660,7 @@
                 <w:b/>
                 <w:color w:val="FFFFFF"/>
               </w:rPr>
-              <w:t>Status</w:t>
+              <w:t>Verification Status</w:t>
             </w:r>
           </w:p>
         </w:tc>
@@ -915,7 +948,7 @@
     </w:tbl>
     <w:p>
       <w:pPr>
-        <w:spacing w:after="200"/>
+        <w:spacing w:after="160"/>
       </w:pPr>
     </w:p>
     <w:p>
@@ -934,7 +967,112 @@
     </w:p>
     <w:p>
       <w:r>
-        <w:t>The system is structured as a 3-tier modular architecture designed for performance, security, and independent deployment:</w:t>
+        <w:t>The system is architected as a modular 3-tier application designed for high performance, security, and cloud scalability:</w:t>
+      </w:r>
+    </w:p>
+    <w:tbl>
+      <w:tblPr>
+        <w:tblW w:type="auto" w:w="0"/>
+        <w:jc w:val="center"/>
+        <w:tblLook w:firstColumn="1" w:firstRow="1" w:lastColumn="0" w:lastRow="0" w:noHBand="0" w:noVBand="1" w:val="04A0"/>
+      </w:tblPr>
+      <w:tblGrid>
+        <w:gridCol w:w="9936"/>
+      </w:tblGrid>
+      <w:tr>
+        <w:tc>
+          <w:tcPr>
+            <w:tcW w:type="dxa" w:w="9936"/>
+            <w:shd w:fill="F4F6F8"/>
+            <w:tcMar>
+              <w:top w:w="140" w:type="dxa"/>
+              <w:bottom w:w="140" w:type="dxa"/>
+              <w:left w:w="180" w:type="dxa"/>
+              <w:right w:w="180" w:type="dxa"/>
+            </w:tcMar>
+          </w:tcPr>
+          <w:p>
+            <w:pPr>
+              <w:spacing w:after="0" w:line="276" w:lineRule="auto"/>
+            </w:pPr>
+            <w:r>
+              <w:rPr>
+                <w:rFonts w:ascii="Consolas" w:hAnsi="Consolas"/>
+                <w:color w:val="1F2937"/>
+                <w:sz w:val="19"/>
+              </w:rPr>
+              <w:t>┌────────────────────────────────────────────────────────────────────────┐</w:t>
+              <w:br/>
+              <w:t>│                           Client Layer                                 │</w:t>
+              <w:br/>
+              <w:t>│  React 18 + TypeScript (Vite Single Page Application)                  │</w:t>
+              <w:br/>
+              <w:t>│  - Mapbox GL JS &amp; @mapbox/mapbox-gl-draw                               │</w:t>
+              <w:br/>
+              <w:t>│  - Chart.js (react-chartjs-2) Time-Series Visualizations               │</w:t>
+              <w:br/>
+              <w:t>└───────────────────────────────────┬────────────────────────────────────┘</w:t>
+              <w:br/>
+              <w:t xml:space="preserve">                                    │ HTTPS / REST API (JWT)</w:t>
+              <w:br/>
+              <w:t xml:space="preserve">                                    ▼</w:t>
+              <w:br/>
+              <w:t>┌────────────────────────────────────────────────────────────────────────┐</w:t>
+              <w:br/>
+              <w:t>│                           Backend Layer                                │</w:t>
+              <w:br/>
+              <w:t>│  FastAPI (Python 3.11) Web Service                                     │</w:t>
+              <w:br/>
+              <w:t>│  - Pydantic v2 validation &amp; automatic OpenAPI docs                     │</w:t>
+              <w:br/>
+              <w:t>│  - SQLAlchemy 2.0 ORM &amp; GeoAlchemy2 PostGIS Integration                │</w:t>
+              <w:br/>
+              <w:t>│  - Alembic Database Schema Migrations                                  │</w:t>
+              <w:br/>
+              <w:t>└───────────────────────────────────┬────────────────────────────────────┘</w:t>
+              <w:br/>
+              <w:t xml:space="preserve">                                    │ SQL / Native PostGIS 3.4</w:t>
+              <w:br/>
+              <w:t xml:space="preserve">                                    ▼</w:t>
+              <w:br/>
+              <w:t>┌────────────────────────────────────────────────────────────────────────┐</w:t>
+              <w:br/>
+              <w:t>│                          Database Layer                                │</w:t>
+              <w:br/>
+              <w:t>│  PostgreSQL 16 + PostGIS 3.4 (Aiven Cloud Database)                     │</w:t>
+              <w:br/>
+              <w:t>│  - Geometry(POLYGON, 4326) Spatial Indexes                             │</w:t>
+              <w:br/>
+              <w:t>│  - Users / Projects / Sites / Site Metrics Tables                      │</w:t>
+              <w:br/>
+              <w:t>└────────────────────────────────────────────────────────────────────────┘</w:t>
+            </w:r>
+          </w:p>
+        </w:tc>
+      </w:tr>
+    </w:tbl>
+    <w:p>
+      <w:pPr>
+        <w:spacing w:after="120"/>
+      </w:pPr>
+    </w:p>
+    <w:p>
+      <w:pPr>
+        <w:spacing w:before="320" w:after="120"/>
+      </w:pPr>
+      <w:r>
+        <w:rPr>
+          <w:rFonts w:ascii="Calibri" w:hAnsi="Calibri"/>
+          <w:b/>
+          <w:color w:val="0F2C59"/>
+          <w:sz w:val="32"/>
+        </w:rPr>
+        <w:t>5. Database Schema &amp; Spatial Data Modeling</w:t>
+      </w:r>
+    </w:p>
+    <w:p>
+      <w:r>
+        <w:t>The database schema consists of 4 normalized tables created via Alembic migrations (backend/alembic/versions/0001_initial_schema.py):</w:t>
       </w:r>
     </w:p>
     <w:p>
@@ -947,10 +1085,10 @@
           <w:b/>
           <w:color w:val="0F2C59"/>
         </w:rPr>
-        <w:t xml:space="preserve">Frontend Layer (React SPA): </w:t>
+        <w:t xml:space="preserve">1. USERS: </w:t>
       </w:r>
       <w:r>
-        <w:t>Built with React 18, Vite, and TypeScript. Implements dynamic code-splitting, Mapbox GL JS map controls, mapbox-gl-draw polygon creation, popups, basemap switcher, color legend, and Chart.js metrics.</w:t>
+        <w:t>id (varchar 36 PK), email (varchar 255 UNIQUE indexed), full_name (varchar 255), hashed_password (varchar 255 bcrypt hash), created_at (timestamptz).</w:t>
       </w:r>
     </w:p>
     <w:p>
@@ -963,10 +1101,10 @@
           <w:b/>
           <w:color w:val="0F2C59"/>
         </w:rPr>
-        <w:t xml:space="preserve">Backend Layer (FastAPI API): </w:t>
+        <w:t xml:space="preserve">2. PROJECTS: </w:t>
       </w:r>
       <w:r>
-        <w:t>Async-capable FastAPI service running Python 3.11. Implements strict Pydantic v2 schemas, SQLAlchemy 2.0 ORM, GeoAlchemy2 spatial integration, JWT authentication, and Alembic database migrations.</w:t>
+        <w:t>id (varchar 36 PK), name (varchar 255), description (text), project_type (enum: carbon, biodiversity, mixed), owner_id (FK -&gt; users.id), created_at, updated_at.</w:t>
       </w:r>
     </w:p>
     <w:p>
@@ -979,10 +1117,26 @@
           <w:b/>
           <w:color w:val="0F2C59"/>
         </w:rPr>
-        <w:t xml:space="preserve">Database Layer (PostgreSQL + PostGIS): </w:t>
+        <w:t xml:space="preserve">3. SITES: </w:t>
       </w:r>
       <w:r>
-        <w:t>Managed PostgreSQL 16 database with PostGIS 3.4 extension on Aiven. Stores spatial geometries as native Geometry(POLYGON, 4326) with spatial indexing capability.</w:t>
+        <w:t>id (varchar 36 PK), project_id (FK -&gt; projects.id), name (varchar 255), description (text), geom (Geometry(POLYGON, 4326) PostGIS WGS84), area_hectares (float computed server-side via ST_Area), created_at.</w:t>
+      </w:r>
+    </w:p>
+    <w:p>
+      <w:pPr>
+        <w:pStyle w:val="ListBullet"/>
+        <w:spacing w:after="80"/>
+      </w:pPr>
+      <w:r>
+        <w:rPr>
+          <w:b/>
+          <w:color w:val="0F2C59"/>
+        </w:rPr>
+        <w:t xml:space="preserve">4. SITE_METRICS: </w:t>
+      </w:r>
+      <w:r>
+        <w:t>id (varchar 36 PK), site_id (FK -&gt; sites.id), metric_type (enum: ndvi, carbon_stock_tco2e, biodiversity_index, canopy_cover_pct), recorded_on (date), value (float).</w:t>
       </w:r>
     </w:p>
     <w:p>
@@ -996,91 +1150,12 @@
           <w:color w:val="0F2C59"/>
           <w:sz w:val="32"/>
         </w:rPr>
-        <w:t>5. Database Schema &amp; Entity Relationships</w:t>
+        <w:t>6. Code Quality, Pre-Commit Hooks &amp; CI/CD Pipeline</w:t>
       </w:r>
     </w:p>
     <w:p>
       <w:r>
-        <w:t>The database schema consists of 4 normalized tables designed for high throughput and spatial capabilities:</w:t>
-      </w:r>
-    </w:p>
-    <w:p>
-      <w:pPr>
-        <w:pStyle w:val="ListBullet"/>
-        <w:spacing w:after="80"/>
-      </w:pPr>
-      <w:r>
-        <w:rPr>
-          <w:b/>
-        </w:rPr>
-        <w:t xml:space="preserve">USERS: </w:t>
-      </w:r>
-      <w:r>
-        <w:t>Stores authenticated administrator accounts (id, email, full_name, hashed_password, created_at).</w:t>
-      </w:r>
-    </w:p>
-    <w:p>
-      <w:pPr>
-        <w:pStyle w:val="ListBullet"/>
-        <w:spacing w:after="80"/>
-      </w:pPr>
-      <w:r>
-        <w:rPr>
-          <w:b/>
-        </w:rPr>
-        <w:t xml:space="preserve">PROJECTS: </w:t>
-      </w:r>
-      <w:r>
-        <w:t>Stores carbon/biodiversity project details (id, name, description, project_type, owner_id FK -&gt; USERS, timestamps). Strictly scoped per owner.</w:t>
-      </w:r>
-    </w:p>
-    <w:p>
-      <w:pPr>
-        <w:pStyle w:val="ListBullet"/>
-        <w:spacing w:after="80"/>
-      </w:pPr>
-      <w:r>
-        <w:rPr>
-          <w:b/>
-        </w:rPr>
-        <w:t xml:space="preserve">SITES: </w:t>
-      </w:r>
-      <w:r>
-        <w:t>Stores geographic site boundaries (id, project_id FK -&gt; PROJECTS, name, description, geom POLYGON(4326), area_hectares).</w:t>
-      </w:r>
-    </w:p>
-    <w:p>
-      <w:pPr>
-        <w:pStyle w:val="ListBullet"/>
-        <w:spacing w:after="80"/>
-      </w:pPr>
-      <w:r>
-        <w:rPr>
-          <w:b/>
-        </w:rPr>
-        <w:t xml:space="preserve">SITE_METRICS: </w:t>
-      </w:r>
-      <w:r>
-        <w:t>Long/narrow time-series table storing monthly metrics (id, site_id FK -&gt; SITES, metric_type enum, recorded_on date, value float).</w:t>
-      </w:r>
-    </w:p>
-    <w:p>
-      <w:pPr>
-        <w:spacing w:before="320" w:after="120"/>
-      </w:pPr>
-      <w:r>
-        <w:rPr>
-          <w:rFonts w:ascii="Calibri" w:hAnsi="Calibri"/>
-          <w:b/>
-          <w:color w:val="0F2C59"/>
-          <w:sz w:val="32"/>
-        </w:rPr>
-        <w:t>6. Code Quality, Pre-Commit Hooks &amp; CI/CD</w:t>
-      </w:r>
-    </w:p>
-    <w:p>
-      <w:r>
-        <w:t>The repository maintains strict engineering standards across backend and frontend codebases:</w:t>
+        <w:t>To ensure long-term stability and maintainability, two automated enforcement layers are configured in the repository:</w:t>
       </w:r>
     </w:p>
     <w:p>
@@ -1099,11 +1174,11 @@
     </w:p>
     <w:p>
       <w:r>
-        <w:t>Configured via .husky/pre-commit to automatically lint and format code before every git commit:</w:t>
+        <w:t>Configured via .husky/pre-commit to automatically inspect staged files before every git commit:</w:t>
         <w:br/>
-        <w:t>• Backend (*.py): Formatted with Black and linted with Ruff check --fix.</w:t>
+        <w:t>• Backend (*.py): Runs Black formatting and Ruff check --fix.</w:t>
         <w:br/>
-        <w:t>• Frontend (*.ts, *.tsx): Formatted with Prettier and linted with ESLint --max-warnings=0.</w:t>
+        <w:t>• Frontend (*.ts, *.tsx, *.css): Runs Prettier formatting and ESLint --max-warnings=0.</w:t>
       </w:r>
     </w:p>
     <w:p>
@@ -1122,11 +1197,11 @@
     </w:p>
     <w:p>
       <w:r>
-        <w:t>Automated workflow (.github/workflows/ci.yml) running on every push/PR:</w:t>
+        <w:t>Automated workflow (.github/workflows/ci.yml) executing in parallel on every push and pull request to main:</w:t>
         <w:br/>
-        <w:t>• Backend Job: Boots live postgis/postgis:16-3.4 container, validates alembic upgrade head, checks Black/Ruff, and executes Pytest suite.</w:t>
+        <w:t>• Backend Job: Spins up a live postgis/postgis:16-3.4 container, validates alembic upgrade head, checks Black &amp; Ruff, and executes the complete Pytest suite.</w:t>
         <w:br/>
-        <w:t>• Frontend Job: Executes npm ci, ESLint, Prettier format check, TypeScript strict typecheck (tsc --noEmit), and Vite production build.</w:t>
+        <w:t>• Frontend Job: Executes npm ci, ESLint, Prettier format check, TypeScript strict typecheck (tsc --noEmit), and Vite production bundle compilation.</w:t>
       </w:r>
     </w:p>
     <w:p>
@@ -1140,7 +1215,7 @@
           <w:color w:val="0F2C59"/>
           <w:sz w:val="32"/>
         </w:rPr>
-        <w:t>7. Architectural Trade-offs &amp; Design Decisions</w:t>
+        <w:t>7. Architectural Trade-offs &amp; Technical Decisions</w:t>
       </w:r>
     </w:p>
     <w:p>
@@ -1214,18 +1289,18 @@
           <w:color w:val="0F2C59"/>
           <w:sz w:val="32"/>
         </w:rPr>
-        <w:t>8. Local Quickstart Instructions</w:t>
+        <w:t>8. Local Setup &amp; Quickstart Guide</w:t>
       </w:r>
     </w:p>
     <w:p>
       <w:r>
-        <w:t>To run the application locally via Docker Compose:</w:t>
+        <w:t>To run the full-stack application locally via Docker Compose:</w:t>
       </w:r>
     </w:p>
-    <w:p/>
     <w:tbl>
       <w:tblPr>
         <w:tblW w:type="auto" w:w="0"/>
+        <w:jc w:val="center"/>
         <w:tblLook w:firstColumn="1" w:firstRow="1" w:lastColumn="0" w:lastRow="0" w:noHBand="0" w:noVBand="1" w:val="04A0"/>
       </w:tblPr>
       <w:tblGrid>
@@ -1236,11 +1311,103 @@
           <w:tcPr>
             <w:tcW w:type="dxa" w:w="9936"/>
             <w:shd w:fill="F4F6F8"/>
+            <w:tcMar>
+              <w:top w:w="140" w:type="dxa"/>
+              <w:bottom w:w="140" w:type="dxa"/>
+              <w:left w:w="180" w:type="dxa"/>
+              <w:right w:w="180" w:type="dxa"/>
+            </w:tcMar>
           </w:tcPr>
-          <w:p/>
+          <w:p>
+            <w:pPr>
+              <w:spacing w:after="0" w:line="276" w:lineRule="auto"/>
+            </w:pPr>
+            <w:r>
+              <w:rPr>
+                <w:rFonts w:ascii="Consolas" w:hAnsi="Consolas"/>
+                <w:color w:val="1F2937"/>
+                <w:sz w:val="19"/>
+              </w:rPr>
+              <w:t># 1. Clone repository</w:t>
+              <w:br/>
+              <w:t>git clone https://github.com/aayushpatilcodes-dot/darukaa-earth.git</w:t>
+              <w:br/>
+              <w:t>cd darukaa-earth</w:t>
+              <w:br/>
+              <w:br/>
+              <w:t># 2. Configure Environment</w:t>
+              <w:br/>
+              <w:t>echo "VITE_MAPBOX_TOKEN=&lt;your-mapbox-access-token&gt;" &gt; .env</w:t>
+              <w:br/>
+              <w:br/>
+              <w:t># 3. Spin up Backend, Frontend &amp; PostGIS Database</w:t>
+              <w:br/>
+              <w:t>docker compose up --build</w:t>
+              <w:br/>
+              <w:br/>
+              <w:t># 4. Seed Demo Data (in a separate terminal)</w:t>
+              <w:br/>
+              <w:t>docker compose exec backend python -m app.seed</w:t>
+            </w:r>
+          </w:p>
         </w:tc>
       </w:tr>
     </w:tbl>
+    <w:p>
+      <w:pPr>
+        <w:spacing w:after="120"/>
+      </w:pPr>
+    </w:p>
+    <w:p>
+      <w:r>
+        <w:t>Default Access Endpoints:</w:t>
+      </w:r>
+    </w:p>
+    <w:p>
+      <w:pPr>
+        <w:pStyle w:val="ListBullet"/>
+        <w:spacing w:after="60"/>
+      </w:pPr>
+      <w:r>
+        <w:rPr>
+          <w:b/>
+        </w:rPr>
+        <w:t xml:space="preserve">Frontend Dashboard: </w:t>
+      </w:r>
+      <w:r>
+        <w:t>http://localhost:5173</w:t>
+      </w:r>
+    </w:p>
+    <w:p>
+      <w:pPr>
+        <w:pStyle w:val="ListBullet"/>
+        <w:spacing w:after="60"/>
+      </w:pPr>
+      <w:r>
+        <w:rPr>
+          <w:b/>
+        </w:rPr>
+        <w:t xml:space="preserve">FastAPI OpenAPI Docs: </w:t>
+      </w:r>
+      <w:r>
+        <w:t>http://localhost:8000/docs</w:t>
+      </w:r>
+    </w:p>
+    <w:p>
+      <w:pPr>
+        <w:pStyle w:val="ListBullet"/>
+        <w:spacing w:after="60"/>
+      </w:pPr>
+      <w:r>
+        <w:rPr>
+          <w:b/>
+        </w:rPr>
+        <w:t xml:space="preserve">Demo Credentials: </w:t>
+      </w:r>
+      <w:r>
+        <w:t>demo@darukaa.earth / DarukaaDemo123!</w:t>
+      </w:r>
+    </w:p>
     <w:sectPr>
       <w:pgSz w:w="12240" w:h="15840"/>
       <w:pgMar w:top="1152" w:right="1152" w:bottom="1152" w:left="1152" w:header="720" w:footer="720" w:gutter="0"/>
@@ -1616,7 +1783,7 @@
     <w:rsid w:val="00FC693F"/>
     <w:rPr>
       <w:rFonts w:ascii="Calibri" w:hAnsi="Calibri"/>
-      <w:color w:val="333333"/>
+      <w:color w:val="222222"/>
       <w:sz w:val="22"/>
     </w:rPr>
   </w:style>

</xml_diff>